<commit_message>
fix: preserve thesis visuals and place SOP2 chart
</commit_message>
<xml_diff>
--- a/docs/with-sop-2.docx
+++ b/docs/with-sop-2.docx
@@ -2335,7 +2335,7 @@
               <w:highlight w:val="yellow"/>
               <w:rtl w:val="0"/>
             </w:rPr>
-            <w:t xml:space="preserve">85</w:t>
+            <w:t xml:space="preserve">86</w:t>
           </w:r>
           <w:r>
             <w:rPr>
@@ -2378,7 +2378,7 @@
               <w:highlight w:val="yellow"/>
               <w:rtl w:val="0"/>
             </w:rPr>
-            <w:t xml:space="preserve">89</w:t>
+            <w:t xml:space="preserve">90</w:t>
           </w:r>
           <w:r>
             <w:rPr>
@@ -2421,7 +2421,7 @@
               <w:highlight w:val="yellow"/>
               <w:rtl w:val="0"/>
             </w:rPr>
-            <w:t xml:space="preserve">93</w:t>
+            <w:t xml:space="preserve">94</w:t>
           </w:r>
           <w:r>
             <w:rPr>
@@ -2459,7 +2459,7 @@
               <w:highlight w:val="yellow"/>
               <w:rtl w:val="0"/>
             </w:rPr>
-            <w:t xml:space="preserve">93</w:t>
+            <w:t xml:space="preserve">94</w:t>
           </w:r>
           <w:r>
             <w:rPr>
@@ -2498,7 +2498,7 @@
               <w:highlight w:val="yellow"/>
               <w:rtl w:val="0"/>
             </w:rPr>
-            <w:t xml:space="preserve">93</w:t>
+            <w:t xml:space="preserve">94</w:t>
           </w:r>
           <w:r>
             <w:rPr>
@@ -2537,7 +2537,7 @@
               <w:highlight w:val="yellow"/>
               <w:rtl w:val="0"/>
             </w:rPr>
-            <w:t xml:space="preserve">94</w:t>
+            <w:t xml:space="preserve">95</w:t>
           </w:r>
           <w:r>
             <w:rPr>
@@ -2576,7 +2576,7 @@
               <w:highlight w:val="yellow"/>
               <w:rtl w:val="0"/>
             </w:rPr>
-            <w:t xml:space="preserve">95</w:t>
+            <w:t xml:space="preserve">96</w:t>
           </w:r>
           <w:r>
             <w:rPr>
@@ -2614,7 +2614,7 @@
               <w:highlight w:val="yellow"/>
               <w:rtl w:val="0"/>
             </w:rPr>
-            <w:t xml:space="preserve">96</w:t>
+            <w:t xml:space="preserve">97</w:t>
           </w:r>
           <w:r>
             <w:rPr>
@@ -3284,6 +3284,38 @@
               <w:highlight w:val="yellow"/>
               <w:rtl w:val="0"/>
             </w:rPr>
+            <w:t xml:space="preserve">PSEi sensitivity to the MSE calibration weight across four held-out folds</w:t>
+          </w:r>
+          <w:r>
+            <w:rPr>
+              <w:rtl w:val="0"/>
+            </w:rPr>
+            <w:tab/>
+            <w:t xml:space="preserve">85</w:t>
+          </w:r>
+        </w:p>
+        <w:p>
+          <w:pPr>
+            <w:widowControl w:val="0"/>
+            <w:tabs>
+              <w:tab w:val="right" w:leader="hyphen" w:pos="12000"/>
+            </w:tabs>
+            <w:spacing w:after="0" w:before="60" w:line="240" w:lineRule="auto"/>
+            <w:ind w:firstLine="0"/>
+            <w:jc w:val="left"/>
+            <w:rPr/>
+          </w:pPr>
+          <w:r>
+            <w:rPr>
+              <w:rtl w:val="0"/>
+            </w:rPr>
+            <w:t xml:space="preserve">Figure 4.4 </w:t>
+          </w:r>
+          <w:r>
+            <w:rPr>
+              <w:highlight w:val="yellow"/>
+              <w:rtl w:val="0"/>
+            </w:rPr>
             <w:t xml:space="preserve">Paired PSEi differences and 95% intervals</w:t>
           </w:r>
           <w:r>
@@ -3291,7 +3323,7 @@
               <w:rtl w:val="0"/>
             </w:rPr>
             <w:tab/>
-            <w:t xml:space="preserve">89</w:t>
+            <w:t xml:space="preserve">90</w:t>
           </w:r>
         </w:p>
         <w:p>
@@ -3315,7 +3347,7 @@
             <w:rPr>
               <w:rtl w:val="0"/>
             </w:rPr>
-            <w:t xml:space="preserve">Figure 4.4 </w:t>
+            <w:t xml:space="preserve">Figure 4.5 </w:t>
           </w:r>
           <w:r>
             <w:rPr>
@@ -3329,7 +3361,7 @@
               <w:rtl w:val="0"/>
             </w:rPr>
             <w:tab/>
-            <w:t xml:space="preserve">93</w:t>
+            <w:t xml:space="preserve">94</w:t>
           </w:r>
           <w:r>
             <w:rPr>
@@ -3916,7 +3948,7 @@
               <w:rtl w:val="0"/>
             </w:rPr>
             <w:tab/>
-            <w:t xml:space="preserve">85</w:t>
+            <w:t xml:space="preserve">86</w:t>
           </w:r>
         </w:p>
         <w:p>
@@ -3947,7 +3979,7 @@
               <w:rtl w:val="0"/>
             </w:rPr>
             <w:tab/>
-            <w:t xml:space="preserve">89</w:t>
+            <w:t xml:space="preserve">90</w:t>
           </w:r>
           <w:r>
             <w:fldChar w:fldCharType="end"/>
@@ -10706,6 +10738,7 @@
       </w:pPr>
       <w:r>
         <w:rPr>
+          <w:highlight w:val="yellow"/>
           <w:rtl w:val="0"/>
         </w:rPr>
         <w:t xml:space="preserve">Convert the predicted return into a continuous trading signal using the hyperbolic tangent function: </w:t>
@@ -10808,7 +10841,7 @@
                                 <w:sz w:val="38"/>
                                 <w:vertAlign w:val="baseline"/>
                               </w:rPr>
-                              <w:t xml:space="preserve">OBJECTIVE 2 - Direction-Sensitive Trading Signal  </w:t>
+                              <w:t xml:space="preserve">OBJECTIVES 1–3 – Shared Position Mapping</w:t>
                             </w:r>
                           </w:p>
                         </w:txbxContent>
@@ -11038,8 +11071,122 @@
       <w:r>
         <w:rPr>
           <w:highlight w:val="yellow"/>
-        </w:rPr>
-        <w:t>A positive signal represents long-oriented continuous exposure, a negative signal short-oriented exposure, and |sₜ| its magnitude, bounded below 1. The implementation sets α from the training-return standard deviation of each fold using earlier data only. The same differentiable tanh mapping applies at every SOP 2 weight; varying λ changes the learned forecasts entering that mapping. A stable sign can still reflect persistent exposure rather than skillful timing.</w:t>
+          <w:rtl w:val="0"/>
+        </w:rPr>
+        <w:t xml:space="preserve">A positive signal represents long-oriented continuous exposure, a negative signal short-oriented exposure, and |sₜ| its magnitude, bounded below 1. The implementation sets α from the training-return standard deviation of each fold using earlier data only. The same differentiable tanh mapping applies at every SOP 2 weight; varying λ changes the learned forecasts entering that mapping. A stable sign can still reflect persistent exposure rather than skillful timing.</w:t>
+      </w:r>
+      <w:r>
+        <w:rPr/>
+        <mc:AlternateContent>
+          <mc:Choice Requires="wpg">
+            <w:drawing>
+              <wp:anchor allowOverlap="1" behindDoc="0" distB="114300" distT="114300" distL="114300" distR="114300" hidden="0" layoutInCell="1" locked="0" relativeHeight="0" simplePos="0">
+                <wp:simplePos x="0" y="0"/>
+                <wp:positionH relativeFrom="column">
+                  <wp:posOffset>866775</wp:posOffset>
+                </wp:positionH>
+                <wp:positionV relativeFrom="paragraph">
+                  <wp:posOffset>2058724</wp:posOffset>
+                </wp:positionV>
+                <wp:extent cx="4889500" cy="419100"/>
+                <wp:effectExtent b="0" l="0" r="0" t="0"/>
+                <wp:wrapNone/>
+                <wp:docPr id="17" name=""/>
+                <a:graphic>
+                  <a:graphicData uri="http://schemas.microsoft.com/office/word/2010/wordprocessingShape">
+                    <wps:wsp>
+                      <wps:cNvSpPr txBox="1"/>
+                      <wps:cNvPr id="2" name="Shape 2"/>
+                      <wps:spPr>
+                        <a:xfrm>
+                          <a:off x="5014400" y="1221125"/>
+                          <a:ext cx="5731800" cy="467700"/>
+                        </a:xfrm>
+                        <a:prstGeom prst="rect">
+                          <a:avLst/>
+                        </a:prstGeom>
+                        <a:noFill/>
+                        <a:ln>
+                          <a:noFill/>
+                        </a:ln>
+                      </wps:spPr>
+                      <wps:txbx>
+                        <w:txbxContent>
+                          <w:p>
+                            <w:pPr>
+                              <w:spacing w:after="0" w:before="0" w:line="240"/>
+                              <w:ind w:left="0" w:right="0" w:firstLine="0"/>
+                              <w:jc w:val="left"/>
+                              <w:textDirection w:val="btLr"/>
+                            </w:pPr>
+                            <w:r>
+                              <w:rPr>
+                                <w:rFonts w:ascii="Times New Roman" w:cs="Times New Roman" w:eastAsia="Times New Roman" w:hAnsi="Times New Roman"/>
+                                <w:b w:val="1"/>
+                                <w:i w:val="0"/>
+                                <w:smallCaps w:val="0"/>
+                                <w:strike w:val="0"/>
+                                <w:color w:val="ff0000"/>
+                                <w:sz w:val="38"/>
+                                <w:vertAlign w:val="baseline"/>
+                              </w:rPr>
+                              <w:t xml:space="preserve">OBJECTIVE 2 – MSE Calibration Weight Sensitivity</w:t>
+                            </w:r>
+                          </w:p>
+                        </w:txbxContent>
+                      </wps:txbx>
+                      <wps:bodyPr anchorCtr="0" anchor="t" bIns="91425" lIns="91425" spcFirstLastPara="1" rIns="91425" wrap="square" tIns="91425">
+                        <a:noAutofit/>
+                      </wps:bodyPr>
+                    </wps:wsp>
+                  </a:graphicData>
+                </a:graphic>
+              </wp:anchor>
+            </w:drawing>
+          </mc:Choice>
+          <mc:Fallback>
+            <w:drawing>
+              <wp:anchor allowOverlap="1" behindDoc="0" distB="114300" distT="114300" distL="114300" distR="114300" hidden="0" layoutInCell="1" locked="0" relativeHeight="0" simplePos="0">
+                <wp:simplePos x="0" y="0"/>
+                <wp:positionH relativeFrom="column">
+                  <wp:posOffset>866775</wp:posOffset>
+                </wp:positionH>
+                <wp:positionV relativeFrom="paragraph">
+                  <wp:posOffset>2058724</wp:posOffset>
+                </wp:positionV>
+                <wp:extent cx="4889500" cy="419100"/>
+                <wp:effectExtent b="0" l="0" r="0" t="0"/>
+                <wp:wrapNone/>
+                <wp:docPr id="17" name="image60.png"/>
+                <a:graphic>
+                  <a:graphicData uri="http://schemas.openxmlformats.org/drawingml/2006/picture">
+                    <pic:pic>
+                      <pic:nvPicPr>
+                        <pic:cNvPr id="0" name="image60.png"/>
+                        <pic:cNvPicPr preferRelativeResize="0"/>
+                      </pic:nvPicPr>
+                      <pic:blipFill>
+                        <a:blip r:embed="rId20"/>
+                        <a:srcRect/>
+                        <a:stretch>
+                          <a:fillRect/>
+                        </a:stretch>
+                      </pic:blipFill>
+                      <pic:spPr>
+                        <a:xfrm>
+                          <a:off x="0" y="0"/>
+                          <a:ext cx="4889500" cy="419100"/>
+                        </a:xfrm>
+                        <a:prstGeom prst="rect"/>
+                        <a:ln/>
+                      </pic:spPr>
+                    </pic:pic>
+                  </a:graphicData>
+                </a:graphic>
+              </wp:anchor>
+            </w:drawing>
+          </mc:Fallback>
+        </mc:AlternateContent>
       </w:r>
     </w:p>
     <w:p>
@@ -12204,8 +12351,298 @@
       <w:r>
         <w:rPr>
           <w:highlight w:val="yellow"/>
-        </w:rPr>
-        <w:t>Because tanh saturates for large absolute predicted returns, a purely profit-driven loss can keep rewarding a nearly fixed position without anchoring the raw forecast to a realistic return scale. The MSE calibration term penalizes this divergence. SOP 2 measures whether greater calibration weight reduces held-out error and exposure magnitude, and whether any such change improves or reduces cost-adjusted simulated return.</w:t>
+          <w:rtl w:val="0"/>
+        </w:rPr>
+        <w:t xml:space="preserve">Because </w:t>
+      </w:r>
+      <w:hyperlink r:id="rId44">
+        <w:r>
+          <w:rPr/>
+          <w:drawing>
+            <wp:inline distB="19050" distT="19050" distL="19050" distR="19050">
+              <wp:extent cx="304800" cy="101600"/>
+              <wp:effectExtent b="0" l="0" r="0" t="0"/>
+              <wp:docPr id="40" name="image5.png"/>
+              <a:graphic>
+                <a:graphicData uri="http://schemas.openxmlformats.org/drawingml/2006/picture">
+                  <pic:pic>
+                    <pic:nvPicPr>
+                      <pic:cNvPr id="0" name="image5.png"/>
+                      <pic:cNvPicPr preferRelativeResize="0"/>
+                    </pic:nvPicPr>
+                    <pic:blipFill>
+                      <a:blip r:embed="rId45"/>
+                      <a:srcRect b="0" l="0" r="0" t="0"/>
+                      <a:stretch>
+                        <a:fillRect/>
+                      </a:stretch>
+                    </pic:blipFill>
+                    <pic:spPr>
+                      <a:xfrm>
+                        <a:off x="0" y="0"/>
+                        <a:ext cx="304800" cy="101600"/>
+                      </a:xfrm>
+                      <a:prstGeom prst="rect"/>
+                      <a:ln/>
+                    </pic:spPr>
+                  </pic:pic>
+                </a:graphicData>
+              </a:graphic>
+            </wp:inline>
+          </w:drawing>
+        </w:r>
+      </w:hyperlink>
+      <w:r>
+        <w:rPr>
+          <w:highlight w:val="yellow"/>
+          <w:rtl w:val="0"/>
+        </w:rPr>
+        <w:t xml:space="preserve"> saturates for large </w:t>
+      </w:r>
+      <w:hyperlink r:id="rId46">
+        <w:r>
+          <w:rPr/>
+          <w:drawing>
+            <wp:inline distB="19050" distT="19050" distL="19050" distR="19050">
+              <wp:extent cx="304800" cy="152400"/>
+              <wp:effectExtent b="0" l="0" r="0" t="0"/>
+              <wp:docPr id="53" name="image23.png"/>
+              <a:graphic>
+                <a:graphicData uri="http://schemas.openxmlformats.org/drawingml/2006/picture">
+                  <pic:pic>
+                    <pic:nvPicPr>
+                      <pic:cNvPr id="0" name="image23.png"/>
+                      <pic:cNvPicPr preferRelativeResize="0"/>
+                    </pic:nvPicPr>
+                    <pic:blipFill>
+                      <a:blip r:embed="rId47"/>
+                      <a:srcRect b="0" l="0" r="0" t="0"/>
+                      <a:stretch>
+                        <a:fillRect/>
+                      </a:stretch>
+                    </pic:blipFill>
+                    <pic:spPr>
+                      <a:xfrm>
+                        <a:off x="0" y="0"/>
+                        <a:ext cx="304800" cy="152400"/>
+                      </a:xfrm>
+                      <a:prstGeom prst="rect"/>
+                      <a:ln/>
+                    </pic:spPr>
+                  </pic:pic>
+                </a:graphicData>
+              </a:graphic>
+            </wp:inline>
+          </w:drawing>
+        </w:r>
+      </w:hyperlink>
+      <w:r>
+        <w:rPr>
+          <w:highlight w:val="yellow"/>
+          <w:rtl w:val="0"/>
+        </w:rPr>
+        <w:t xml:space="preserve">, a purely profit-driven objective has no incentive to keep </w:t>
+      </w:r>
+      <w:hyperlink r:id="rId48">
+        <w:r>
+          <w:rPr/>
+          <w:drawing>
+            <wp:inline distB="19050" distT="19050" distL="19050" distR="19050">
+              <wp:extent cx="114300" cy="152400"/>
+              <wp:effectExtent b="0" l="0" r="0" t="0"/>
+              <wp:docPr id="72" name="image55.png"/>
+              <a:graphic>
+                <a:graphicData uri="http://schemas.openxmlformats.org/drawingml/2006/picture">
+                  <pic:pic>
+                    <pic:nvPicPr>
+                      <pic:cNvPr id="0" name="image55.png"/>
+                      <pic:cNvPicPr preferRelativeResize="0"/>
+                    </pic:nvPicPr>
+                    <pic:blipFill>
+                      <a:blip r:embed="rId39"/>
+                      <a:srcRect b="0" l="0" r="0" t="0"/>
+                      <a:stretch>
+                        <a:fillRect/>
+                      </a:stretch>
+                    </pic:blipFill>
+                    <pic:spPr>
+                      <a:xfrm>
+                        <a:off x="0" y="0"/>
+                        <a:ext cx="114300" cy="152400"/>
+                      </a:xfrm>
+                      <a:prstGeom prst="rect"/>
+                      <a:ln/>
+                    </pic:spPr>
+                  </pic:pic>
+                </a:graphicData>
+              </a:graphic>
+            </wp:inline>
+          </w:drawing>
+        </w:r>
+      </w:hyperlink>
+      <w:r>
+        <w:rPr>
+          <w:highlight w:val="yellow"/>
+          <w:rtl w:val="0"/>
+        </w:rPr>
+        <w:t xml:space="preserve"> near the actual return's scale once the signal is already saturated at </w:t>
+      </w:r>
+      <w:hyperlink r:id="rId49">
+        <w:r>
+          <w:rPr/>
+          <w:drawing>
+            <wp:inline distB="19050" distT="19050" distL="19050" distR="19050">
+              <wp:extent cx="190500" cy="114300"/>
+              <wp:effectExtent b="0" l="0" r="0" t="0"/>
+              <wp:docPr id="69" name="image51.png"/>
+              <a:graphic>
+                <a:graphicData uri="http://schemas.openxmlformats.org/drawingml/2006/picture">
+                  <pic:pic>
+                    <pic:nvPicPr>
+                      <pic:cNvPr id="0" name="image51.png"/>
+                      <pic:cNvPicPr preferRelativeResize="0"/>
+                    </pic:nvPicPr>
+                    <pic:blipFill>
+                      <a:blip r:embed="rId50"/>
+                      <a:srcRect b="0" l="0" r="0" t="0"/>
+                      <a:stretch>
+                        <a:fillRect/>
+                      </a:stretch>
+                    </pic:blipFill>
+                    <pic:spPr>
+                      <a:xfrm>
+                        <a:off x="0" y="0"/>
+                        <a:ext cx="190500" cy="114300"/>
+                      </a:xfrm>
+                      <a:prstGeom prst="rect"/>
+                      <a:ln/>
+                    </pic:spPr>
+                  </pic:pic>
+                </a:graphicData>
+              </a:graphic>
+            </wp:inline>
+          </w:drawing>
+        </w:r>
+      </w:hyperlink>
+      <w:r>
+        <w:rPr>
+          <w:highlight w:val="yellow"/>
+          <w:rtl w:val="0"/>
+        </w:rPr>
+        <w:t xml:space="preserve"> — the calibration term penalizes predictions far from realized returns. SOP 2 measures whether changing its weight reduces held-out error and exposure magnitude, and how that change affects cost-adjusted simulated return.</w:t>
+      </w:r>
+      <w:r>
+        <w:rPr/>
+        <mc:AlternateContent>
+          <mc:Choice Requires="wpg">
+            <w:drawing>
+              <wp:anchor allowOverlap="1" behindDoc="0" distB="114300" distT="114300" distL="114300" distR="114300" hidden="0" layoutInCell="1" locked="0" relativeHeight="0" simplePos="0">
+                <wp:simplePos x="0" y="0"/>
+                <wp:positionH relativeFrom="column">
+                  <wp:posOffset>2324100</wp:posOffset>
+                </wp:positionH>
+                <wp:positionV relativeFrom="paragraph">
+                  <wp:posOffset>1539174</wp:posOffset>
+                </wp:positionV>
+                <wp:extent cx="3218688" cy="419100"/>
+                <wp:effectExtent b="0" l="0" r="0" t="0"/>
+                <wp:wrapNone/>
+                <wp:docPr id="6" name=""/>
+                <a:graphic>
+                  <a:graphicData uri="http://schemas.microsoft.com/office/word/2010/wordprocessingShape">
+                    <wps:wsp>
+                      <wps:cNvSpPr txBox="1"/>
+                      <wps:cNvPr id="2" name="Shape 2"/>
+                      <wps:spPr>
+                        <a:xfrm>
+                          <a:off x="4526800" y="1211175"/>
+                          <a:ext cx="3701700" cy="467700"/>
+                        </a:xfrm>
+                        <a:prstGeom prst="rect">
+                          <a:avLst/>
+                        </a:prstGeom>
+                        <a:noFill/>
+                        <a:ln>
+                          <a:noFill/>
+                        </a:ln>
+                      </wps:spPr>
+                      <wps:txbx>
+                        <w:txbxContent>
+                          <w:p>
+                            <w:pPr>
+                              <w:spacing w:after="0" w:before="0" w:line="240"/>
+                              <w:ind w:left="0" w:right="0" w:firstLine="0"/>
+                              <w:jc w:val="left"/>
+                              <w:textDirection w:val="btLr"/>
+                            </w:pPr>
+                            <w:r>
+                              <w:rPr>
+                                <w:rFonts w:ascii="Times New Roman" w:cs="Times New Roman" w:eastAsia="Times New Roman" w:hAnsi="Times New Roman"/>
+                                <w:b w:val="1"/>
+                                <w:i w:val="0"/>
+                                <w:smallCaps w:val="0"/>
+                                <w:strike w:val="0"/>
+                                <w:color w:val="ff0000"/>
+                                <w:sz w:val="38"/>
+                                <w:vertAlign w:val="baseline"/>
+                              </w:rPr>
+                              <w:t xml:space="preserve">OBJECTIVE 3 - Trading Friction  </w:t>
+                            </w:r>
+                          </w:p>
+                        </w:txbxContent>
+                      </wps:txbx>
+                      <wps:bodyPr anchorCtr="0" anchor="t" bIns="91425" lIns="91425" spcFirstLastPara="1" rIns="91425" wrap="square" tIns="91425">
+                        <a:noAutofit/>
+                      </wps:bodyPr>
+                    </wps:wsp>
+                  </a:graphicData>
+                </a:graphic>
+              </wp:anchor>
+            </w:drawing>
+          </mc:Choice>
+          <mc:Fallback>
+            <w:drawing>
+              <wp:anchor allowOverlap="1" behindDoc="0" distB="114300" distT="114300" distL="114300" distR="114300" hidden="0" layoutInCell="1" locked="0" relativeHeight="0" simplePos="0">
+                <wp:simplePos x="0" y="0"/>
+                <wp:positionH relativeFrom="column">
+                  <wp:posOffset>2324100</wp:posOffset>
+                </wp:positionH>
+                <wp:positionV relativeFrom="paragraph">
+                  <wp:posOffset>1539174</wp:posOffset>
+                </wp:positionV>
+                <wp:extent cx="3218688" cy="419100"/>
+                <wp:effectExtent b="0" l="0" r="0" t="0"/>
+                <wp:wrapNone/>
+                <wp:docPr id="6" name="image42.png"/>
+                <a:graphic>
+                  <a:graphicData uri="http://schemas.openxmlformats.org/drawingml/2006/picture">
+                    <pic:pic>
+                      <pic:nvPicPr>
+                        <pic:cNvPr id="0" name="image42.png"/>
+                        <pic:cNvPicPr preferRelativeResize="0"/>
+                      </pic:nvPicPr>
+                      <pic:blipFill>
+                        <a:blip r:embed="rId20"/>
+                        <a:srcRect/>
+                        <a:stretch>
+                          <a:fillRect/>
+                        </a:stretch>
+                      </pic:blipFill>
+                      <pic:spPr>
+                        <a:xfrm>
+                          <a:off x="0" y="0"/>
+                          <a:ext cx="3218688" cy="419100"/>
+                        </a:xfrm>
+                        <a:prstGeom prst="rect"/>
+                        <a:ln/>
+                      </pic:spPr>
+                    </pic:pic>
+                  </a:graphicData>
+                </a:graphic>
+              </wp:anchor>
+            </w:drawing>
+          </mc:Fallback>
+        </mc:AlternateContent>
       </w:r>
     </w:p>
     <w:p>
@@ -12369,9 +12806,222 @@
       </w:pPr>
       <w:r>
         <w:rPr>
-          <w:highlight w:val="yellow"/>
-        </w:rPr>
-        <w:t>Given: cost-adjusted simulated trading profit, MSE calibration term, sample count, and calibration weight λ (principal setting 0.7).</w:t>
+          <w:b w:val="1"/>
+          <w:bCs w:val="1"/>
+          <w:i w:val="1"/>
+          <w:iCs w:val="1"/>
+          <w:rtl w:val="0"/>
+        </w:rPr>
+        <w:t xml:space="preserve">Given:</w:t>
+      </w:r>
+      <w:r>
+        <w:rPr>
+          <w:rtl w:val="0"/>
+        </w:rPr>
+        <w:t xml:space="preserve"> </w:t>
+      </w:r>
+      <m:oMath>
+        <m:r>
+          <w:rPr/>
+          <m:t xml:space="preserve">profi</m:t>
+        </m:r>
+        <m:sSub>
+          <m:sSubPr>
+            <m:ctrlPr>
+              <w:rPr/>
+            </m:ctrlPr>
+          </m:sSubPr>
+          <m:e>
+            <m:r>
+              <w:rPr/>
+              <m:t xml:space="preserve">t</m:t>
+            </m:r>
+          </m:e>
+          <m:sub>
+            <m:r>
+              <w:rPr/>
+              <m:t xml:space="preserve">t</m:t>
+            </m:r>
+          </m:sub>
+        </m:sSub>
+      </m:oMath>
+      <w:r>
+        <w:rPr>
+          <w:rtl w:val="0"/>
+        </w:rPr>
+        <w:t xml:space="preserve">​ cost-adjusted simulated trading profit, </w:t>
+      </w:r>
+      <w:hyperlink r:id="rId51">
+        <w:r>
+          <w:rPr/>
+          <w:drawing>
+            <wp:inline distB="19050" distT="19050" distL="19050" distR="19050">
+              <wp:extent cx="419100" cy="127000"/>
+              <wp:effectExtent b="0" l="0" r="0" t="0"/>
+              <wp:docPr id="47" name="image14.png"/>
+              <a:graphic>
+                <a:graphicData uri="http://schemas.openxmlformats.org/drawingml/2006/picture">
+                  <pic:pic>
+                    <pic:nvPicPr>
+                      <pic:cNvPr id="0" name="image14.png"/>
+                      <pic:cNvPicPr preferRelativeResize="0"/>
+                    </pic:nvPicPr>
+                    <pic:blipFill>
+                      <a:blip r:embed="rId52"/>
+                      <a:srcRect b="0" l="0" r="0" t="0"/>
+                      <a:stretch>
+                        <a:fillRect/>
+                      </a:stretch>
+                    </pic:blipFill>
+                    <pic:spPr>
+                      <a:xfrm>
+                        <a:off x="0" y="0"/>
+                        <a:ext cx="419100" cy="127000"/>
+                      </a:xfrm>
+                      <a:prstGeom prst="rect"/>
+                      <a:ln/>
+                    </pic:spPr>
+                  </pic:pic>
+                </a:graphicData>
+              </a:graphic>
+            </wp:inline>
+          </w:drawing>
+        </w:r>
+      </w:hyperlink>
+      <w:r>
+        <w:rPr>
+          <w:rtl w:val="0"/>
+        </w:rPr>
+        <w:t xml:space="preserve"> MSE calibration term, </w:t>
+      </w:r>
+      <w:hyperlink r:id="rId53">
+        <w:r>
+          <w:rPr/>
+          <w:drawing>
+            <wp:inline distB="19050" distT="19050" distL="19050" distR="19050">
+              <wp:extent cx="127000" cy="101600"/>
+              <wp:effectExtent b="0" l="0" r="0" t="0"/>
+              <wp:docPr id="36" name="image7.png"/>
+              <a:graphic>
+                <a:graphicData uri="http://schemas.openxmlformats.org/drawingml/2006/picture">
+                  <pic:pic>
+                    <pic:nvPicPr>
+                      <pic:cNvPr id="0" name="image7.png"/>
+                      <pic:cNvPicPr preferRelativeResize="0"/>
+                    </pic:nvPicPr>
+                    <pic:blipFill>
+                      <a:blip r:embed="rId54"/>
+                      <a:srcRect b="0" l="0" r="0" t="0"/>
+                      <a:stretch>
+                        <a:fillRect/>
+                      </a:stretch>
+                    </pic:blipFill>
+                    <pic:spPr>
+                      <a:xfrm>
+                        <a:off x="0" y="0"/>
+                        <a:ext cx="127000" cy="101600"/>
+                      </a:xfrm>
+                      <a:prstGeom prst="rect"/>
+                      <a:ln/>
+                    </pic:spPr>
+                  </pic:pic>
+                </a:graphicData>
+              </a:graphic>
+            </wp:inline>
+          </w:drawing>
+        </w:r>
+      </w:hyperlink>
+      <w:r>
+        <w:rPr>
+          <w:rtl w:val="0"/>
+        </w:rPr>
+        <w:t xml:space="preserve"> number of samples, </w:t>
+      </w:r>
+      <w:hyperlink r:id="rId55">
+        <w:r>
+          <w:rPr/>
+          <w:drawing>
+            <wp:inline distB="19050" distT="19050" distL="19050" distR="19050">
+              <wp:extent cx="88900" cy="101600"/>
+              <wp:effectExtent b="0" l="0" r="0" t="0"/>
+              <wp:docPr id="65" name="image33.png"/>
+              <a:graphic>
+                <a:graphicData uri="http://schemas.openxmlformats.org/drawingml/2006/picture">
+                  <pic:pic>
+                    <pic:nvPicPr>
+                      <pic:cNvPr id="0" name="image33.png"/>
+                      <pic:cNvPicPr preferRelativeResize="0"/>
+                    </pic:nvPicPr>
+                    <pic:blipFill>
+                      <a:blip r:embed="rId56"/>
+                      <a:srcRect b="0" l="0" r="0" t="0"/>
+                      <a:stretch>
+                        <a:fillRect/>
+                      </a:stretch>
+                    </pic:blipFill>
+                    <pic:spPr>
+                      <a:xfrm>
+                        <a:off x="0" y="0"/>
+                        <a:ext cx="88900" cy="101600"/>
+                      </a:xfrm>
+                      <a:prstGeom prst="rect"/>
+                      <a:ln/>
+                    </pic:spPr>
+                  </pic:pic>
+                </a:graphicData>
+              </a:graphic>
+            </wp:inline>
+          </w:drawing>
+        </w:r>
+      </w:hyperlink>
+      <w:r>
+        <w:rPr>
+          <w:rtl w:val="0"/>
+        </w:rPr>
+        <w:t xml:space="preserve"> calibration weight (default </w:t>
+      </w:r>
+      <w:hyperlink r:id="rId57">
+        <w:r>
+          <w:rPr/>
+          <w:drawing>
+            <wp:inline distB="19050" distT="19050" distL="19050" distR="19050">
+              <wp:extent cx="482600" cy="101600"/>
+              <wp:effectExtent b="0" l="0" r="0" t="0"/>
+              <wp:docPr id="43" name="image12.png"/>
+              <a:graphic>
+                <a:graphicData uri="http://schemas.openxmlformats.org/drawingml/2006/picture">
+                  <pic:pic>
+                    <pic:nvPicPr>
+                      <pic:cNvPr id="0" name="image12.png"/>
+                      <pic:cNvPicPr preferRelativeResize="0"/>
+                    </pic:nvPicPr>
+                    <pic:blipFill>
+                      <a:blip r:embed="rId58"/>
+                      <a:srcRect b="0" l="0" r="0" t="0"/>
+                      <a:stretch>
+                        <a:fillRect/>
+                      </a:stretch>
+                    </pic:blipFill>
+                    <pic:spPr>
+                      <a:xfrm>
+                        <a:off x="0" y="0"/>
+                        <a:ext cx="482600" cy="101600"/>
+                      </a:xfrm>
+                      <a:prstGeom prst="rect"/>
+                      <a:ln/>
+                    </pic:spPr>
+                  </pic:pic>
+                </a:graphicData>
+              </a:graphic>
+            </wp:inline>
+          </w:drawing>
+        </w:r>
+      </w:hyperlink>
+      <w:r>
+        <w:rPr>
+          <w:rtl w:val="0"/>
+        </w:rPr>
+        <w:t xml:space="preserve">) </w:t>
       </w:r>
     </w:p>
     <w:p>
@@ -12468,8 +13118,122 @@
       <w:r>
         <w:rPr>
           <w:highlight w:val="yellow"/>
-        </w:rPr>
-        <w:t>This loss rewards simulated net return and, when λ &gt; 0, penalizes forecast error. At λ = 0 the profit term remains, but MSE calibration is absent. The tanh position transform is differentiable in forward and backward passes; the current implementation does not use a straight-through sign estimator. Position persistence and saturation are checked after training rather than assumed to improve.</w:t>
+          <w:rtl w:val="0"/>
+        </w:rPr>
+        <w:t xml:space="preserve">This loss rewards simulated net return and, when λ &gt; 0, penalizes forecast error. At λ = 0 the profit term remains, but MSE calibration is absent. The tanh position transform is differentiable in forward and backward passes; the current implementation does not use a straight-through sign estimator. Position persistence and saturation are checked after training rather than assumed to improve.</w:t>
+      </w:r>
+      <w:r>
+        <w:rPr/>
+        <mc:AlternateContent>
+          <mc:Choice Requires="wpg">
+            <w:drawing>
+              <wp:anchor allowOverlap="1" behindDoc="0" distB="114300" distT="114300" distL="114300" distR="114300" hidden="0" layoutInCell="1" locked="0" relativeHeight="0" simplePos="0">
+                <wp:simplePos x="0" y="0"/>
+                <wp:positionH relativeFrom="column">
+                  <wp:posOffset>1314450</wp:posOffset>
+                </wp:positionH>
+                <wp:positionV relativeFrom="paragraph">
+                  <wp:posOffset>1076325</wp:posOffset>
+                </wp:positionV>
+                <wp:extent cx="4169626" cy="417958"/>
+                <wp:effectExtent b="0" l="0" r="0" t="0"/>
+                <wp:wrapNone/>
+                <wp:docPr id="13" name=""/>
+                <a:graphic>
+                  <a:graphicData uri="http://schemas.microsoft.com/office/word/2010/wordprocessingShape">
+                    <wps:wsp>
+                      <wps:cNvSpPr txBox="1"/>
+                      <wps:cNvPr id="2" name="Shape 2"/>
+                      <wps:spPr>
+                        <a:xfrm>
+                          <a:off x="4526800" y="1211175"/>
+                          <a:ext cx="4856100" cy="467700"/>
+                        </a:xfrm>
+                        <a:prstGeom prst="rect">
+                          <a:avLst/>
+                        </a:prstGeom>
+                        <a:noFill/>
+                        <a:ln>
+                          <a:noFill/>
+                        </a:ln>
+                      </wps:spPr>
+                      <wps:txbx>
+                        <w:txbxContent>
+                          <w:p>
+                            <w:pPr>
+                              <w:spacing w:after="0" w:before="0" w:line="240"/>
+                              <w:ind w:left="0" w:right="0" w:firstLine="0"/>
+                              <w:jc w:val="left"/>
+                              <w:textDirection w:val="btLr"/>
+                            </w:pPr>
+                            <w:r>
+                              <w:rPr>
+                                <w:rFonts w:ascii="Times New Roman" w:cs="Times New Roman" w:eastAsia="Times New Roman" w:hAnsi="Times New Roman"/>
+                                <w:b w:val="1"/>
+                                <w:i w:val="0"/>
+                                <w:smallCaps w:val="0"/>
+                                <w:strike w:val="0"/>
+                                <w:color w:val="ff0000"/>
+                                <w:sz w:val="38"/>
+                                <w:vertAlign w:val="baseline"/>
+                              </w:rPr>
+                              <w:t xml:space="preserve">OBJECTIVES 1–3 – Profit-Aware Loss</w:t>
+                            </w:r>
+                          </w:p>
+                        </w:txbxContent>
+                      </wps:txbx>
+                      <wps:bodyPr anchorCtr="0" anchor="t" bIns="91425" lIns="91425" spcFirstLastPara="1" rIns="91425" wrap="square" tIns="91425">
+                        <a:noAutofit/>
+                      </wps:bodyPr>
+                    </wps:wsp>
+                  </a:graphicData>
+                </a:graphic>
+              </wp:anchor>
+            </w:drawing>
+          </mc:Choice>
+          <mc:Fallback>
+            <w:drawing>
+              <wp:anchor allowOverlap="1" behindDoc="0" distB="114300" distT="114300" distL="114300" distR="114300" hidden="0" layoutInCell="1" locked="0" relativeHeight="0" simplePos="0">
+                <wp:simplePos x="0" y="0"/>
+                <wp:positionH relativeFrom="column">
+                  <wp:posOffset>1314450</wp:posOffset>
+                </wp:positionH>
+                <wp:positionV relativeFrom="paragraph">
+                  <wp:posOffset>1076325</wp:posOffset>
+                </wp:positionV>
+                <wp:extent cx="4169626" cy="417958"/>
+                <wp:effectExtent b="0" l="0" r="0" t="0"/>
+                <wp:wrapNone/>
+                <wp:docPr id="13" name="image50.png"/>
+                <a:graphic>
+                  <a:graphicData uri="http://schemas.openxmlformats.org/drawingml/2006/picture">
+                    <pic:pic>
+                      <pic:nvPicPr>
+                        <pic:cNvPr id="0" name="image50.png"/>
+                        <pic:cNvPicPr preferRelativeResize="0"/>
+                      </pic:nvPicPr>
+                      <pic:blipFill>
+                        <a:blip r:embed="rId20"/>
+                        <a:srcRect/>
+                        <a:stretch>
+                          <a:fillRect/>
+                        </a:stretch>
+                      </pic:blipFill>
+                      <pic:spPr>
+                        <a:xfrm>
+                          <a:off x="0" y="0"/>
+                          <a:ext cx="4169626" cy="417958"/>
+                        </a:xfrm>
+                        <a:prstGeom prst="rect"/>
+                        <a:ln/>
+                      </pic:spPr>
+                    </pic:pic>
+                  </a:graphicData>
+                </a:graphic>
+              </wp:anchor>
+            </w:drawing>
+          </mc:Fallback>
+        </mc:AlternateContent>
       </w:r>
     </w:p>
     <w:p>
@@ -12662,6 +13426,7 @@
       </w:pPr>
       <w:r>
         <w:rPr>
+          <w:highlight w:val="yellow"/>
           <w:rtl w:val="0"/>
         </w:rPr>
         <w:t xml:space="preserve">Compute the gradients of the loss with respect to the GRU model parameters and update the parameters using the AdamW optimizer (with weight decay to further discourage prediction-magnitude divergence).</w:t>
@@ -12721,7 +13486,7 @@
                                 <w:sz w:val="38"/>
                                 <w:vertAlign w:val="baseline"/>
                               </w:rPr>
-                              <w:t xml:space="preserve">OBJECTIVE 1 - Profit-Aware Loss Learning </w:t>
+                              <w:t xml:space="preserve">OBJECTIVES 1–3 – Model Training</w:t>
                             </w:r>
                           </w:p>
                         </w:txbxContent>
@@ -24200,6 +24965,76 @@
         <w:t>These results support a limited calibration conclusion: increasing λ constrained prediction scale and improved RMSE in this test sweep, while reducing exposure and observed return. The return pattern cannot identify a generally best λ because the weights were examined on the held-out windows, only one seed was used, and a mostly falling PSEi rewarded persistent short exposure. The λ = 0.7 value remains the prespecified main benchmark setting, not a test-selected optimum. Source: results/sop2_lambda_comparison.csv and SOP2_REPRODUCTION.md in the repository.</w:t>
       </w:r>
     </w:p>
+    <w:tbl>
+      <w:tblPr>
+        <w:tblW w:type="auto" w:w="0"/>
+        <w:tblLook w:firstColumn="1" w:firstRow="1" w:lastColumn="0" w:lastRow="0" w:noHBand="0" w:noVBand="1" w:val="04A0"/>
+      </w:tblPr>
+      <w:tblGrid>
+        <w:gridCol w:w="8640"/>
+      </w:tblGrid>
+      <w:tr>
+        <w:trPr>
+          <w:cantSplit/>
+        </w:trPr>
+        <w:tc>
+          <w:tcPr>
+            <w:tcW w:type="dxa" w:w="8640"/>
+          </w:tcPr>
+          <w:p>
+            <w:pPr>
+              <w:jc w:val="center"/>
+            </w:pPr>
+            <w:r>
+              <w:rPr>
+                <w:sz w:val="20"/>
+                <w:highlight w:val="yellow"/>
+              </w:rPr>
+              <w:t>Figure 4.3 PSEi sensitivity to the MSE calibration weight across four held-out folds. Source: repository SOP 2 comparison output.</w:t>
+            </w:r>
+          </w:p>
+          <w:p>
+            <w:pPr>
+              <w:jc w:val="center"/>
+            </w:pPr>
+            <w:r>
+              <w:drawing>
+                <wp:inline>
+                  <wp:extent cx="4754880" cy="3328416"/>
+                  <wp:docPr id="74" name="Picture 74"/>
+                  <wp:cNvGraphicFramePr>
+                    <a:graphicFrameLocks noChangeAspect="1"/>
+                  </wp:cNvGraphicFramePr>
+                  <a:graphic>
+                    <a:graphicData uri="http://schemas.openxmlformats.org/drawingml/2006/picture">
+                      <pic:pic>
+                        <pic:nvPicPr>
+                          <pic:cNvPr id="0" name="sop2_lambda_sensitivity.png"/>
+                          <pic:cNvPicPr/>
+                        </pic:nvPicPr>
+                        <pic:blipFill>
+                          <a:blip r:embed="rId99"/>
+                          <a:stretch>
+                            <a:fillRect/>
+                          </a:stretch>
+                        </pic:blipFill>
+                        <pic:spPr>
+                          <a:xfrm>
+                            <a:off x="0" y="0"/>
+                            <a:ext cx="4754880" cy="3328416"/>
+                          </a:xfrm>
+                          <a:prstGeom prst="rect"/>
+                        </pic:spPr>
+                      </pic:pic>
+                    </a:graphicData>
+                  </a:graphic>
+                </wp:inline>
+              </w:drawing>
+            </w:r>
+          </w:p>
+        </w:tc>
+      </w:tr>
+    </w:tbl>
     <w:p>
       <w:pPr>
         <w:pStyle w:val="Heading2"/>
@@ -25167,9 +26002,10 @@
           <w:iCs w:val="1"/>
           <w:sz w:val="22"/>
           <w:szCs w:val="22"/>
-          <w:rtl w:val="0"/>
-        </w:rPr>
-        <w:t xml:space="preserve">Figure 4.3 Paired differences and 95% intervals. Source: committed significance output.</w:t>
+          <w:highlight w:val="yellow"/>
+          <w:rtl w:val="0"/>
+        </w:rPr>
+        <w:t xml:space="preserve">Figure 4.4 Paired differences and 95% intervals. Source: committed significance output.</w:t>
       </w:r>
     </w:p>
     <w:p>
@@ -26135,9 +26971,10 @@
           <w:iCs w:val="1"/>
           <w:sz w:val="22"/>
           <w:szCs w:val="22"/>
-          <w:rtl w:val="0"/>
-        </w:rPr>
-        <w:t xml:space="preserve">Figure 4.4 Zero-cost and stated-cost outcomes of three training conditions. Source: committed ablation chart.</w:t>
+          <w:highlight w:val="yellow"/>
+          <w:rtl w:val="0"/>
+        </w:rPr>
+        <w:t xml:space="preserve">Figure 4.5 Zero-cost and stated-cost outcomes of three training conditions. Source: committed ablation chart.</w:t>
       </w:r>
     </w:p>
     <w:p>

</xml_diff>

<commit_message>
docs: correct Chapter 1 figure interpretation
</commit_message>
<xml_diff>
--- a/docs/with-sop-2.docx
+++ b/docs/with-sop-2.docx
@@ -3019,8 +3019,9 @@
           <w:r>
             <w:rPr>
               <w:rtl w:val="0"/>
+              <w:highlight w:val="yellow"/>
             </w:rPr>
-            <w:t xml:space="preserve">Example of Low Prediction Error but Negative Trading Profit </w:t>
+            <w:t xml:space="preserve">Original Colab Simulation of Actual and Noisy Predicted Prices </w:t>
             <w:br w:type="textWrapping"/>
             <w:t xml:space="preserve">(Source: Simulation generated using Google Colab)</w:t>
             <w:tab/>
@@ -3102,8 +3103,9 @@
           <w:r>
             <w:rPr>
               <w:rtl w:val="0"/>
+              <w:highlight w:val="yellow"/>
             </w:rPr>
-            <w:t xml:space="preserve">Impact of Transaction Costs on Simulated Trading Profit</w:t>
+            <w:t xml:space="preserve">Fixed Per-Observation Cost in an Illustrative Trading Simulation</w:t>
             <w:br w:type="textWrapping"/>
             <w:t xml:space="preserve">(Source: Simulation generated using Google Colab</w:t>
           </w:r>
@@ -5783,8 +5785,9 @@
           <w:b w:val="0"/>
           <w:bCs w:val="0"/>
           <w:rtl w:val="0"/>
-        </w:rPr>
-        <w:t xml:space="preserve">Example of Low Prediction Error but Negative Trading Profit  (Source: Simulation generated using Google Colab</w:t>
+          <w:highlight w:val="yellow"/>
+        </w:rPr>
+        <w:t xml:space="preserve">Original Colab Simulation of Actual and Noisy Predicted Prices  (Source: Simulation generated using Google Colab)</w:t>
       </w:r>
       <w:r>
         <w:rPr>
@@ -5846,8 +5849,9 @@
       <w:r>
         <w:rPr>
           <w:rtl w:val="0"/>
-        </w:rPr>
-        <w:t xml:space="preserve">Figure 1.2 is a reproducible numerical example, not a held-out PSEi result. It shows that a small return-forecast error can still put a simulated position on the losing side of a daily move. Chapter Four reports the actual four-fold PSEi outcomes separately, so the illustration does not predetermine the empirical result.</w:t>
+          <w:highlight w:val="yellow"/>
+        </w:rPr>
+        <w:t xml:space="preserve">Figure 1.2 shows a 200-day synthetic price path and predicted prices constructed from the realized prices plus random noise (seed 42). The visual illustrates numerical closeness, but it is not an out-of-sample forecast or evidence of negative aggregate trading profit. The original Colab reports positive aggregate simulated gross profit for this path. The held-out four-fold PSEi outcomes are reported separately in Chapter Four.</w:t>
       </w:r>
     </w:p>
     <w:p>
@@ -6245,8 +6249,9 @@
       <w:r>
         <w:rPr>
           <w:rtl w:val="0"/>
-        </w:rPr>
-        <w:t xml:space="preserve">Impact of Transaction Costs on Simulated Trading Profit  (Source: Simulation generated using Google Colab)</w:t>
+          <w:highlight w:val="yellow"/>
+        </w:rPr>
+        <w:t xml:space="preserve">Fixed Per-Observation Cost in an Illustrative Trading Simulation  (Source: Simulation generated using Google Colab)</w:t>
       </w:r>
       <w:r>
         <w:rPr>
@@ -6402,8 +6407,9 @@
       <w:r>
         <w:rPr>
           <w:rtl w:val="0"/>
-        </w:rPr>
-        <w:t xml:space="preserve">As shown in Figure 1.4, simulated trading profit decreases when transaction costs are included. This demonstrates that a model may appear profitable in a simplified simulation but perform less effectively once trading friction is considered. Therefore, the proposed enhanced GRU incorporates a trading friction penalty to optimize cost-adjusted simulated profit rather than theoretical profit alone. </w:t>
+          <w:highlight w:val="yellow"/>
+        </w:rPr>
+        <w:t xml:space="preserve">Figure 1.4 applies the original Colab's fixed 0.5-unit deduction to each simulated observation and shows lower aggregate profit with that illustrative cost. It does not use the asymmetric 0.296%/0.396% position-change cost applied in the PSEi experiment. Chapter Four evaluates the cost-aware GRU under the study's stated simulation assumptions.</w:t>
       </w:r>
     </w:p>
     <w:p>

</xml_diff>